<commit_message>
Expand fictional CVs into two-page examples with richer career detail
</commit_message>
<xml_diff>
--- a/output/avery-quill-quant.docx
+++ b/output/avery-quill-quant.docx
@@ -81,7 +81,7 @@
           <w:u w:val="none"/>
           <w:lang w:val="en-US"/>
         </w:rPr>
-        <w:t>Fictional example. Software engineer focused on measurement, search quality and workflow automation for creative teams. All career details and results are invented.</w:t>
+        <w:t>Fictional example; all career details and results are invented. Software engineer building dependable tools for creative teams, from early prototypes to services used in daily production. Combines backend development, data modelling and close user collaboration with practical experience in search, asynchronous processing and operational support. Enjoys making complex workflows easier to understand, test and maintain.</w:t>
       </w:r>
     </w:p>
     <w:p>
@@ -133,7 +133,7 @@
           <w:u w:val="none"/>
           <w:lang w:val="en-US"/>
         </w:rPr>
-        <w:t xml:space="preserve"> Python, TypeScript, PostgreSQL, REST APIs.</w:t>
+        <w:t xml:space="preserve"> Python, TypeScript, PostgreSQL, REST APIs, background workers.</w:t>
       </w:r>
     </w:p>
     <w:p>
@@ -153,7 +153,7 @@
           <w:u w:val="none"/>
           <w:lang w:val="en-US"/>
         </w:rPr>
-        <w:t>Specialism:</w:t>
+        <w:t>Data and quality:</w:t>
       </w:r>
       <w:r>
         <w:rPr>
@@ -165,7 +165,7 @@
           <w:u w:val="none"/>
           <w:lang w:val="en-US"/>
         </w:rPr>
-        <w:t xml:space="preserve"> Workflow automation, search, integration testing.</w:t>
+        <w:t xml:space="preserve"> Search evaluation, SQL modelling, integration tests, performance profiling.</w:t>
       </w:r>
     </w:p>
     <w:p>
@@ -197,7 +197,39 @@
           <w:u w:val="none"/>
           <w:lang w:val="en-US"/>
         </w:rPr>
-        <w:t xml:space="preserve"> Cloud hosting, Docker, Git, CI/CD.</w:t>
+        <w:t xml:space="preserve"> Docker, Git, CI/CD, cloud hosting, metrics, logs and release automation.</w:t>
+      </w:r>
+    </w:p>
+    <w:p>
+      <w:pPr>
+        <w:pStyle w:val="ResumeBody"/>
+        <w:keepNext w:val="0"/>
+        <w:widowControl/>
+        <w:spacing w:before="0" w:after="0" w:line="255" w:lineRule="exact"/>
+      </w:pPr>
+      <w:r>
+        <w:rPr>
+          <w:rFonts w:ascii="JetBrains Mono" w:hAnsi="JetBrains Mono" w:eastAsia="JetBrains Mono" w:cs="JetBrains Mono"/>
+          <w:b/>
+          <w:i w:val="0"/>
+          <w:color w:val="1F1C18"/>
+          <w:sz w:val="16"/>
+          <w:u w:val="none"/>
+          <w:lang w:val="en-US"/>
+        </w:rPr>
+        <w:t>Collaboration:</w:t>
+      </w:r>
+      <w:r>
+        <w:rPr>
+          <w:rFonts w:ascii="JetBrains Mono" w:hAnsi="JetBrains Mono" w:eastAsia="JetBrains Mono" w:cs="JetBrains Mono"/>
+          <w:b w:val="0"/>
+          <w:i w:val="0"/>
+          <w:color w:val="1F1C18"/>
+          <w:sz w:val="16"/>
+          <w:u w:val="none"/>
+          <w:lang w:val="en-US"/>
+        </w:rPr>
+        <w:t xml:space="preserve"> Technical discovery, design reviews, mentoring, documentation and incident response.</w:t>
       </w:r>
     </w:p>
     <w:p>
@@ -405,6 +437,111 @@
     <w:p>
       <w:pPr>
         <w:pStyle w:val="ResumeBody"/>
+        <w:keepNext w:val="0"/>
+        <w:widowControl/>
+        <w:spacing w:before="40" w:after="0" w:line="255" w:lineRule="exact"/>
+        <w:ind w:left="240" w:hanging="240"/>
+      </w:pPr>
+      <w:r>
+        <w:rPr>
+          <w:rFonts w:ascii="JetBrains Mono" w:hAnsi="JetBrains Mono" w:eastAsia="JetBrains Mono" w:cs="JetBrains Mono"/>
+          <w:b w:val="0"/>
+          <w:i w:val="0"/>
+          <w:color w:val="1F1C18"/>
+          <w:sz w:val="16"/>
+          <w:u w:val="none"/>
+          <w:lang w:val="en-US"/>
+        </w:rPr>
+        <w:t>- Led discovery with eight designers and production coordinators, mapping review decisions and exception paths before defining the service API and its initial release scope.</w:t>
+      </w:r>
+    </w:p>
+    <w:p>
+      <w:pPr>
+        <w:pStyle w:val="ResumeBody"/>
+        <w:keepNext w:val="0"/>
+        <w:widowControl/>
+        <w:spacing w:before="40" w:after="0" w:line="255" w:lineRule="exact"/>
+        <w:ind w:left="240" w:hanging="240"/>
+      </w:pPr>
+      <w:r>
+        <w:rPr>
+          <w:rFonts w:ascii="JetBrains Mono" w:hAnsi="JetBrains Mono" w:eastAsia="JetBrains Mono" w:cs="JetBrains Mono"/>
+          <w:b w:val="0"/>
+          <w:i w:val="0"/>
+          <w:color w:val="1F1C18"/>
+          <w:sz w:val="16"/>
+          <w:u w:val="none"/>
+          <w:lang w:val="en-US"/>
+        </w:rPr>
+        <w:t>- Designed idempotent background workers with bounded retries and a failed-job queue, allowing interrupted processing to resume without creating duplicate assets or notifications.</w:t>
+      </w:r>
+    </w:p>
+    <w:p>
+      <w:pPr>
+        <w:pStyle w:val="ResumeBody"/>
+        <w:keepNext w:val="0"/>
+        <w:widowControl/>
+        <w:spacing w:before="40" w:after="0" w:line="255" w:lineRule="exact"/>
+        <w:ind w:left="240" w:hanging="240"/>
+      </w:pPr>
+      <w:r>
+        <w:rPr>
+          <w:rFonts w:ascii="JetBrains Mono" w:hAnsi="JetBrains Mono" w:eastAsia="JetBrains Mono" w:cs="JetBrains Mono"/>
+          <w:b w:val="0"/>
+          <w:i w:val="0"/>
+          <w:color w:val="1F1C18"/>
+          <w:sz w:val="16"/>
+          <w:u w:val="none"/>
+          <w:lang w:val="en-US"/>
+        </w:rPr>
+        <w:t>- Introduced structured logs, queue-depth alerts and a service dashboard; reduced the time needed to locate common processing failures from roughly 45 minutes to 15 minutes.</w:t>
+      </w:r>
+    </w:p>
+    <w:p>
+      <w:pPr>
+        <w:pStyle w:val="ResumeBody"/>
+        <w:keepNext w:val="0"/>
+        <w:widowControl/>
+        <w:spacing w:before="40" w:after="0" w:line="255" w:lineRule="exact"/>
+        <w:ind w:left="240" w:hanging="240"/>
+      </w:pPr>
+      <w:r>
+        <w:rPr>
+          <w:rFonts w:ascii="JetBrains Mono" w:hAnsi="JetBrains Mono" w:eastAsia="JetBrains Mono" w:cs="JetBrains Mono"/>
+          <w:b w:val="0"/>
+          <w:i w:val="0"/>
+          <w:color w:val="1F1C18"/>
+          <w:sz w:val="16"/>
+          <w:u w:val="none"/>
+          <w:lang w:val="en-US"/>
+        </w:rPr>
+        <w:t>- Established contract tests for three external integrations and staged releases with rollback checks, helping the team ship weekly without relying on a manual release checklist.</w:t>
+      </w:r>
+    </w:p>
+    <w:p>
+      <w:pPr>
+        <w:pStyle w:val="ResumeBody"/>
+        <w:keepNext w:val="0"/>
+        <w:widowControl/>
+        <w:spacing w:before="40" w:after="0" w:line="255" w:lineRule="exact"/>
+        <w:ind w:left="240" w:hanging="240"/>
+      </w:pPr>
+      <w:r>
+        <w:rPr>
+          <w:rFonts w:ascii="JetBrains Mono" w:hAnsi="JetBrains Mono" w:eastAsia="JetBrains Mono" w:cs="JetBrains Mono"/>
+          <w:b w:val="0"/>
+          <w:i w:val="0"/>
+          <w:color w:val="1F1C18"/>
+          <w:sz w:val="16"/>
+          <w:u w:val="none"/>
+          <w:lang w:val="en-US"/>
+        </w:rPr>
+        <w:t>- Mentored two developers through code reviews and paired debugging sessions; wrote decision records explaining storage boundaries, failure handling and operational trade-offs.</w:t>
+      </w:r>
+    </w:p>
+    <w:p>
+      <w:pPr>
+        <w:pStyle w:val="ResumeBody"/>
         <w:keepNext/>
         <w:widowControl/>
         <w:spacing w:before="240" w:after="120" w:line="210" w:lineRule="exact"/>
@@ -563,6 +700,111 @@
     <w:p>
       <w:pPr>
         <w:pStyle w:val="ResumeBody"/>
+        <w:keepNext w:val="0"/>
+        <w:widowControl/>
+        <w:spacing w:before="40" w:after="0" w:line="255" w:lineRule="exact"/>
+        <w:ind w:left="240" w:hanging="240"/>
+      </w:pPr>
+      <w:r>
+        <w:rPr>
+          <w:rFonts w:ascii="JetBrains Mono" w:hAnsi="JetBrains Mono" w:eastAsia="JetBrains Mono" w:cs="JetBrains Mono"/>
+          <w:b w:val="0"/>
+          <w:i w:val="0"/>
+          <w:color w:val="1F1C18"/>
+          <w:sz w:val="16"/>
+          <w:u w:val="none"/>
+          <w:lang w:val="en-US"/>
+        </w:rPr>
+        <w:t>- Built a versioned import API for customer asset libraries, separating validation from persistence so rejected records could be corrected and replayed without restarting a complete batch.</w:t>
+      </w:r>
+    </w:p>
+    <w:p>
+      <w:pPr>
+        <w:pStyle w:val="ResumeBody"/>
+        <w:keepNext w:val="0"/>
+        <w:widowControl/>
+        <w:spacing w:before="40" w:after="0" w:line="255" w:lineRule="exact"/>
+        <w:ind w:left="240" w:hanging="240"/>
+      </w:pPr>
+      <w:r>
+        <w:rPr>
+          <w:rFonts w:ascii="JetBrains Mono" w:hAnsi="JetBrains Mono" w:eastAsia="JetBrains Mono" w:cs="JetBrains Mono"/>
+          <w:b w:val="0"/>
+          <w:i w:val="0"/>
+          <w:color w:val="1F1C18"/>
+          <w:sz w:val="16"/>
+          <w:u w:val="none"/>
+          <w:lang w:val="en-US"/>
+        </w:rPr>
+        <w:t>- Profiled slow catalogue queries and introduced targeted indexes, reducing the median response time for the most-used listing endpoint from 900 milliseconds to 240 milliseconds.</w:t>
+      </w:r>
+    </w:p>
+    <w:p>
+      <w:pPr>
+        <w:pStyle w:val="ResumeBody"/>
+        <w:keepNext w:val="0"/>
+        <w:widowControl/>
+        <w:spacing w:before="40" w:after="0" w:line="255" w:lineRule="exact"/>
+        <w:ind w:left="240" w:hanging="240"/>
+      </w:pPr>
+      <w:r>
+        <w:rPr>
+          <w:rFonts w:ascii="JetBrains Mono" w:hAnsi="JetBrains Mono" w:eastAsia="JetBrains Mono" w:cs="JetBrains Mono"/>
+          <w:b w:val="0"/>
+          <w:i w:val="0"/>
+          <w:color w:val="1F1C18"/>
+          <w:sz w:val="16"/>
+          <w:u w:val="none"/>
+          <w:lang w:val="en-US"/>
+        </w:rPr>
+        <w:t>- Migrated an older metadata format through additive schema changes and a resumable backfill, preserving existing client integrations throughout the transition.</w:t>
+      </w:r>
+    </w:p>
+    <w:p>
+      <w:pPr>
+        <w:pStyle w:val="ResumeBody"/>
+        <w:keepNext w:val="0"/>
+        <w:widowControl/>
+        <w:spacing w:before="40" w:after="0" w:line="255" w:lineRule="exact"/>
+        <w:ind w:left="240" w:hanging="240"/>
+      </w:pPr>
+      <w:r>
+        <w:rPr>
+          <w:rFonts w:ascii="JetBrains Mono" w:hAnsi="JetBrains Mono" w:eastAsia="JetBrains Mono" w:cs="JetBrains Mono"/>
+          <w:b w:val="0"/>
+          <w:i w:val="0"/>
+          <w:color w:val="1F1C18"/>
+          <w:sz w:val="16"/>
+          <w:u w:val="none"/>
+          <w:lang w:val="en-US"/>
+        </w:rPr>
+        <w:t>- Created a representative set of 180 search queries with support colleagues and tracked regressions before releases, making relevance decisions easier to explain and reproduce.</w:t>
+      </w:r>
+    </w:p>
+    <w:p>
+      <w:pPr>
+        <w:pStyle w:val="ResumeBody"/>
+        <w:keepNext w:val="0"/>
+        <w:widowControl/>
+        <w:spacing w:before="40" w:after="0" w:line="255" w:lineRule="exact"/>
+        <w:ind w:left="240" w:hanging="240"/>
+      </w:pPr>
+      <w:r>
+        <w:rPr>
+          <w:rFonts w:ascii="JetBrains Mono" w:hAnsi="JetBrains Mono" w:eastAsia="JetBrains Mono" w:cs="JetBrains Mono"/>
+          <w:b w:val="0"/>
+          <w:i w:val="0"/>
+          <w:color w:val="1F1C18"/>
+          <w:sz w:val="16"/>
+          <w:u w:val="none"/>
+          <w:lang w:val="en-US"/>
+        </w:rPr>
+        <w:t>- Rotated through production support, documented recurring failure patterns and turned the most common fixes into automated checks and clearer customer-facing error messages.</w:t>
+      </w:r>
+    </w:p>
+    <w:p>
+      <w:pPr>
+        <w:pStyle w:val="ResumeBody"/>
         <w:keepNext/>
         <w:widowControl/>
         <w:spacing w:before="240" w:after="120" w:line="210" w:lineRule="exact"/>
@@ -647,6 +889,281 @@
           <w:lang w:val="en-US"/>
         </w:rPr>
         <w:t>- Developed internal reporting tools; added integration tests, documented release steps and supported team handover.</w:t>
+      </w:r>
+    </w:p>
+    <w:p>
+      <w:pPr>
+        <w:pStyle w:val="ResumeBody"/>
+        <w:keepNext w:val="0"/>
+        <w:widowControl/>
+        <w:spacing w:before="40" w:after="0" w:line="255" w:lineRule="exact"/>
+        <w:ind w:left="240" w:hanging="240"/>
+      </w:pPr>
+      <w:r>
+        <w:rPr>
+          <w:rFonts w:ascii="JetBrains Mono" w:hAnsi="JetBrains Mono" w:eastAsia="JetBrains Mono" w:cs="JetBrains Mono"/>
+          <w:b w:val="0"/>
+          <w:i w:val="0"/>
+          <w:color w:val="1F1C18"/>
+          <w:sz w:val="16"/>
+          <w:u w:val="none"/>
+          <w:lang w:val="en-US"/>
+        </w:rPr>
+        <w:t>- Implemented scheduled exports and reconciliation checks for weekly operational reports, replacing spreadsheet copy-and-paste steps with a repeatable pipeline and reviewable exceptions.</w:t>
+      </w:r>
+    </w:p>
+    <w:p>
+      <w:pPr>
+        <w:pStyle w:val="ResumeBody"/>
+        <w:keepNext w:val="0"/>
+        <w:widowControl/>
+        <w:spacing w:before="40" w:after="0" w:line="255" w:lineRule="exact"/>
+        <w:ind w:left="240" w:hanging="240"/>
+      </w:pPr>
+      <w:r>
+        <w:rPr>
+          <w:rFonts w:ascii="JetBrains Mono" w:hAnsi="JetBrains Mono" w:eastAsia="JetBrains Mono" w:cs="JetBrains Mono"/>
+          <w:b w:val="0"/>
+          <w:i w:val="0"/>
+          <w:color w:val="1F1C18"/>
+          <w:sz w:val="16"/>
+          <w:u w:val="none"/>
+          <w:lang w:val="en-US"/>
+        </w:rPr>
+        <w:t>- Added integration fixtures covering permissions, invalid inputs and interrupted imports; used the failures to clarify expected behaviour with the product owner.</w:t>
+      </w:r>
+    </w:p>
+    <w:p>
+      <w:pPr>
+        <w:pStyle w:val="ResumeBody"/>
+        <w:keepNext w:val="0"/>
+        <w:widowControl/>
+        <w:spacing w:before="40" w:after="0" w:line="255" w:lineRule="exact"/>
+        <w:ind w:left="240" w:hanging="240"/>
+      </w:pPr>
+      <w:r>
+        <w:rPr>
+          <w:rFonts w:ascii="JetBrains Mono" w:hAnsi="JetBrains Mono" w:eastAsia="JetBrains Mono" w:cs="JetBrains Mono"/>
+          <w:b w:val="0"/>
+          <w:i w:val="0"/>
+          <w:color w:val="1F1C18"/>
+          <w:sz w:val="16"/>
+          <w:u w:val="none"/>
+          <w:lang w:val="en-US"/>
+        </w:rPr>
+        <w:t>- Prepared onboarding notes and a local development setup used by new team members, including example data, troubleshooting steps and a walkthrough of the release process.</w:t>
+      </w:r>
+    </w:p>
+    <w:p>
+      <w:pPr>
+        <w:pStyle w:val="ResumeBody"/>
+        <w:keepNext/>
+        <w:spacing w:before="220" w:after="100" w:line="230" w:lineRule="exact"/>
+      </w:pPr>
+      <w:r>
+        <w:rPr>
+          <w:rFonts w:ascii="JetBrains Mono" w:hAnsi="JetBrains Mono" w:eastAsia="JetBrains Mono" w:cs="JetBrains Mono"/>
+          <w:b/>
+          <w:i w:val="0"/>
+          <w:color w:val="6F6655"/>
+          <w:sz w:val="18"/>
+          <w:u w:val="none"/>
+          <w:lang w:val="en-US"/>
+          <w:spacing w:val="18"/>
+        </w:rPr>
+        <w:t>SELECTED PROJECTS</w:t>
+      </w:r>
+    </w:p>
+    <w:p>
+      <w:pPr>
+        <w:pStyle w:val="ResumeBody"/>
+        <w:keepNext w:val="0"/>
+        <w:widowControl/>
+        <w:spacing w:before="40" w:after="0" w:line="255" w:lineRule="exact"/>
+      </w:pPr>
+      <w:r>
+        <w:rPr>
+          <w:rFonts w:ascii="JetBrains Mono" w:hAnsi="JetBrains Mono" w:eastAsia="JetBrains Mono" w:cs="JetBrains Mono"/>
+          <w:b/>
+          <w:i w:val="0"/>
+          <w:color w:val="1F1C18"/>
+          <w:sz w:val="16"/>
+          <w:u w:val="none"/>
+          <w:lang w:val="en-US"/>
+        </w:rPr>
+        <w:t>Queue Garden</w:t>
+      </w:r>
+      <w:r>
+        <w:rPr>
+          <w:rFonts w:ascii="JetBrains Mono" w:hAnsi="JetBrains Mono" w:eastAsia="JetBrains Mono" w:cs="JetBrains Mono"/>
+          <w:b w:val="0"/>
+          <w:i w:val="0"/>
+          <w:color w:val="1F1C18"/>
+          <w:sz w:val="16"/>
+          <w:u w:val="none"/>
+          <w:lang w:val="en-US"/>
+        </w:rPr>
+        <w:t xml:space="preserve"> | </w:t>
+      </w:r>
+      <w:hyperlink r:id="rId11">
+        <w:r>
+          <w:rPr>
+            <w:rFonts w:ascii="JetBrains Mono" w:hAnsi="JetBrains Mono" w:eastAsia="JetBrains Mono" w:cs="JetBrains Mono"/>
+            <w:sz w:val="16"/>
+            <w:color w:val="3A5FCD"/>
+            <w:u w:val="single"/>
+            <w:lang w:val="en-US"/>
+          </w:rPr>
+          <w:t>Project notes</w:t>
+        </w:r>
+      </w:hyperlink>
+      <w:r>
+        <w:rPr>
+          <w:rFonts w:ascii="JetBrains Mono" w:hAnsi="JetBrains Mono" w:eastAsia="JetBrains Mono" w:cs="JetBrains Mono"/>
+          <w:b w:val="0"/>
+          <w:i w:val="0"/>
+          <w:color w:val="1F1C18"/>
+          <w:sz w:val="16"/>
+          <w:u w:val="none"/>
+          <w:lang w:val="en-US"/>
+        </w:rPr>
+        <w:t xml:space="preserve"> | 2025</w:t>
+      </w:r>
+    </w:p>
+    <w:p>
+      <w:pPr>
+        <w:pStyle w:val="ResumeBody"/>
+        <w:keepNext w:val="0"/>
+        <w:widowControl/>
+        <w:spacing w:before="40" w:after="0" w:line="255" w:lineRule="exact"/>
+      </w:pPr>
+      <w:r>
+        <w:rPr>
+          <w:rFonts w:ascii="JetBrains Mono" w:hAnsi="JetBrains Mono" w:eastAsia="JetBrains Mono" w:cs="JetBrains Mono"/>
+          <w:b w:val="0"/>
+          <w:i w:val="0"/>
+          <w:color w:val="1F1C18"/>
+          <w:sz w:val="16"/>
+          <w:u w:val="none"/>
+          <w:lang w:val="en-US"/>
+        </w:rPr>
+        <w:t>- Built a small Python job runner to explore retry policies, cancellation and worker recovery. Added fault-injection scenarios for process termination, delayed responses and duplicate delivery; documented which guarantees belonged to the worker and which required application-level checks.</w:t>
+      </w:r>
+    </w:p>
+    <w:p>
+      <w:pPr>
+        <w:pStyle w:val="ResumeBody"/>
+        <w:keepNext w:val="0"/>
+        <w:widowControl/>
+        <w:spacing w:before="40" w:after="0" w:line="255" w:lineRule="exact"/>
+      </w:pPr>
+      <w:r>
+        <w:rPr>
+          <w:rFonts w:ascii="JetBrains Mono" w:hAnsi="JetBrains Mono" w:eastAsia="JetBrains Mono" w:cs="JetBrains Mono"/>
+          <w:b w:val="0"/>
+          <w:i w:val="0"/>
+          <w:color w:val="1F1C18"/>
+          <w:sz w:val="16"/>
+          <w:u w:val="none"/>
+          <w:lang w:val="en-US"/>
+        </w:rPr>
+        <w:t>- Published a reproducible local demo with a queue dashboard and example workloads, allowing colleagues to compare throughput and failure behaviour under controlled conditions.</w:t>
+      </w:r>
+    </w:p>
+    <w:p>
+      <w:pPr>
+        <w:pStyle w:val="ResumeBody"/>
+        <w:keepNext w:val="0"/>
+        <w:widowControl/>
+        <w:spacing w:before="40" w:after="0" w:line="255" w:lineRule="exact"/>
+      </w:pPr>
+      <w:r>
+        <w:rPr>
+          <w:rFonts w:ascii="JetBrains Mono" w:hAnsi="JetBrains Mono" w:eastAsia="JetBrains Mono" w:cs="JetBrains Mono"/>
+          <w:b/>
+          <w:i w:val="0"/>
+          <w:color w:val="1F1C18"/>
+          <w:sz w:val="16"/>
+          <w:u w:val="none"/>
+          <w:lang w:val="en-US"/>
+        </w:rPr>
+        <w:t>Find the Frame</w:t>
+      </w:r>
+      <w:r>
+        <w:rPr>
+          <w:rFonts w:ascii="JetBrains Mono" w:hAnsi="JetBrains Mono" w:eastAsia="JetBrains Mono" w:cs="JetBrains Mono"/>
+          <w:b w:val="0"/>
+          <w:i w:val="0"/>
+          <w:color w:val="1F1C18"/>
+          <w:sz w:val="16"/>
+          <w:u w:val="none"/>
+          <w:lang w:val="en-US"/>
+        </w:rPr>
+        <w:t xml:space="preserve"> | </w:t>
+      </w:r>
+      <w:hyperlink r:id="rId12">
+        <w:r>
+          <w:rPr>
+            <w:rFonts w:ascii="JetBrains Mono" w:hAnsi="JetBrains Mono" w:eastAsia="JetBrains Mono" w:cs="JetBrains Mono"/>
+            <w:sz w:val="16"/>
+            <w:color w:val="3A5FCD"/>
+            <w:u w:val="single"/>
+            <w:lang w:val="en-US"/>
+          </w:rPr>
+          <w:t>Technical walkthrough</w:t>
+        </w:r>
+      </w:hyperlink>
+      <w:r>
+        <w:rPr>
+          <w:rFonts w:ascii="JetBrains Mono" w:hAnsi="JetBrains Mono" w:eastAsia="JetBrains Mono" w:cs="JetBrains Mono"/>
+          <w:b w:val="0"/>
+          <w:i w:val="0"/>
+          <w:color w:val="1F1C18"/>
+          <w:sz w:val="16"/>
+          <w:u w:val="none"/>
+          <w:lang w:val="en-US"/>
+        </w:rPr>
+        <w:t xml:space="preserve"> | 2023</w:t>
+      </w:r>
+    </w:p>
+    <w:p>
+      <w:pPr>
+        <w:pStyle w:val="ResumeBody"/>
+        <w:keepNext w:val="0"/>
+        <w:widowControl/>
+        <w:spacing w:before="40" w:after="0" w:line="255" w:lineRule="exact"/>
+      </w:pPr>
+      <w:r>
+        <w:rPr>
+          <w:rFonts w:ascii="JetBrains Mono" w:hAnsi="JetBrains Mono" w:eastAsia="JetBrains Mono" w:cs="JetBrains Mono"/>
+          <w:b w:val="0"/>
+          <w:i w:val="0"/>
+          <w:color w:val="1F1C18"/>
+          <w:sz w:val="16"/>
+          <w:u w:val="none"/>
+          <w:lang w:val="en-US"/>
+        </w:rPr>
+        <w:t>- Prototyped a catalogue for a fictional community film archive, combining structured metadata filters with text search. Interviewed volunteer librarians, defined a small relevance benchmark and compared ranking changes against the same query set.</w:t>
+      </w:r>
+    </w:p>
+    <w:p>
+      <w:pPr>
+        <w:pStyle w:val="ResumeBody"/>
+        <w:keepNext w:val="0"/>
+        <w:widowControl/>
+        <w:spacing w:before="40" w:after="0" w:line="255" w:lineRule="exact"/>
+      </w:pPr>
+      <w:r>
+        <w:rPr>
+          <w:rFonts w:ascii="JetBrains Mono" w:hAnsi="JetBrains Mono" w:eastAsia="JetBrains Mono" w:cs="JetBrains Mono"/>
+          <w:b w:val="0"/>
+          <w:i w:val="0"/>
+          <w:color w:val="1F1C18"/>
+          <w:sz w:val="16"/>
+          <w:u w:val="none"/>
+          <w:lang w:val="en-US"/>
+        </w:rPr>
+        <w:t>- Added keyboard navigation, clear empty states and import validation. Used feedback from five trial sessions to simplify the search form and make missing metadata visible before publication.</w:t>
       </w:r>
     </w:p>
     <w:p>
@@ -740,6 +1257,70 @@
     <w:p>
       <w:pPr>
         <w:pStyle w:val="ResumeBody"/>
+        <w:keepNext w:val="0"/>
+        <w:widowControl/>
+        <w:spacing w:before="40" w:after="0" w:line="255" w:lineRule="exact"/>
+      </w:pPr>
+      <w:r>
+        <w:rPr>
+          <w:rFonts w:ascii="JetBrains Mono" w:hAnsi="JetBrains Mono" w:eastAsia="JetBrains Mono" w:cs="JetBrains Mono"/>
+          <w:b/>
+          <w:i w:val="0"/>
+          <w:color w:val="1F1C18"/>
+          <w:sz w:val="16"/>
+          <w:u w:val="none"/>
+          <w:lang w:val="en-US"/>
+        </w:rPr>
+        <w:t>Graduation project:</w:t>
+      </w:r>
+      <w:r>
+        <w:rPr>
+          <w:rFonts w:ascii="JetBrains Mono" w:hAnsi="JetBrains Mono" w:eastAsia="JetBrains Mono" w:cs="JetBrains Mono"/>
+          <w:b w:val="0"/>
+          <w:i w:val="0"/>
+          <w:color w:val="1F1C18"/>
+          <w:sz w:val="16"/>
+          <w:u w:val="none"/>
+          <w:lang w:val="en-US"/>
+        </w:rPr>
+        <w:t xml:space="preserve"> Designed and evaluated a task-scheduling simulator, comparing queue policies under uneven workloads and reporting latency, fairness and recovery behaviour.</w:t>
+      </w:r>
+    </w:p>
+    <w:p>
+      <w:pPr>
+        <w:pStyle w:val="ResumeBody"/>
+        <w:keepNext w:val="0"/>
+        <w:widowControl/>
+        <w:spacing w:before="40" w:after="0" w:line="255" w:lineRule="exact"/>
+      </w:pPr>
+      <w:r>
+        <w:rPr>
+          <w:rFonts w:ascii="JetBrains Mono" w:hAnsi="JetBrains Mono" w:eastAsia="JetBrains Mono" w:cs="JetBrains Mono"/>
+          <w:b/>
+          <w:i w:val="0"/>
+          <w:color w:val="1F1C18"/>
+          <w:sz w:val="16"/>
+          <w:u w:val="none"/>
+          <w:lang w:val="en-US"/>
+        </w:rPr>
+        <w:t>Selected coursework:</w:t>
+      </w:r>
+      <w:r>
+        <w:rPr>
+          <w:rFonts w:ascii="JetBrains Mono" w:hAnsi="JetBrains Mono" w:eastAsia="JetBrains Mono" w:cs="JetBrains Mono"/>
+          <w:b w:val="0"/>
+          <w:i w:val="0"/>
+          <w:color w:val="1F1C18"/>
+          <w:sz w:val="16"/>
+          <w:u w:val="none"/>
+          <w:lang w:val="en-US"/>
+        </w:rPr>
+        <w:t xml:space="preserve"> Algorithms, database systems, distributed computing, software testing and human-computer interaction.</w:t>
+      </w:r>
+    </w:p>
+    <w:p>
+      <w:pPr>
+        <w:pStyle w:val="ResumeBody"/>
         <w:keepNext/>
         <w:spacing w:before="220" w:after="100" w:line="230" w:lineRule="exact"/>
       </w:pPr>
@@ -775,6 +1356,106 @@
           <w:lang w:val="en-US"/>
         </w:rPr>
         <w:t>Cloud Foundations | Example Learning Institute</w:t>
+      </w:r>
+    </w:p>
+    <w:p>
+      <w:pPr>
+        <w:pStyle w:val="ResumeBody"/>
+        <w:keepNext w:val="0"/>
+        <w:widowControl/>
+        <w:spacing w:before="40" w:after="0" w:line="255" w:lineRule="exact"/>
+      </w:pPr>
+      <w:r>
+        <w:rPr>
+          <w:rFonts w:ascii="JetBrains Mono" w:hAnsi="JetBrains Mono" w:eastAsia="JetBrains Mono" w:cs="JetBrains Mono"/>
+          <w:b w:val="0"/>
+          <w:i w:val="0"/>
+          <w:color w:val="1F1C18"/>
+          <w:sz w:val="16"/>
+          <w:u w:val="none"/>
+          <w:lang w:val="en-US"/>
+        </w:rPr>
+        <w:t>Accessible Product Delivery | Example Learning Institute | 2024</w:t>
+      </w:r>
+    </w:p>
+    <w:p>
+      <w:pPr>
+        <w:pStyle w:val="ResumeBody"/>
+        <w:keepNext/>
+        <w:spacing w:before="220" w:after="100" w:line="230" w:lineRule="exact"/>
+      </w:pPr>
+      <w:r>
+        <w:rPr>
+          <w:rFonts w:ascii="JetBrains Mono" w:hAnsi="JetBrains Mono" w:eastAsia="JetBrains Mono" w:cs="JetBrains Mono"/>
+          <w:b/>
+          <w:i w:val="0"/>
+          <w:color w:val="6F6655"/>
+          <w:sz w:val="18"/>
+          <w:u w:val="none"/>
+          <w:lang w:val="en-US"/>
+          <w:spacing w:val="18"/>
+        </w:rPr>
+        <w:t>WRITING AND COMMUNITY</w:t>
+      </w:r>
+    </w:p>
+    <w:p>
+      <w:pPr>
+        <w:pStyle w:val="ResumeBody"/>
+        <w:keepNext w:val="0"/>
+        <w:widowControl/>
+        <w:spacing w:before="40" w:after="0" w:line="255" w:lineRule="exact"/>
+      </w:pPr>
+      <w:r>
+        <w:rPr>
+          <w:rFonts w:ascii="JetBrains Mono" w:hAnsi="JetBrains Mono" w:eastAsia="JetBrains Mono" w:cs="JetBrains Mono"/>
+          <w:b w:val="0"/>
+          <w:i w:val="0"/>
+          <w:color w:val="1F1C18"/>
+          <w:sz w:val="16"/>
+          <w:u w:val="none"/>
+          <w:lang w:val="en-US"/>
+        </w:rPr>
+        <w:t>- Wrote a practical guide to diagnosing background-job failures, using worked examples to explain timeouts, retries and duplicate processing to engineers joining the team.</w:t>
+      </w:r>
+    </w:p>
+    <w:p>
+      <w:pPr>
+        <w:pStyle w:val="ResumeBody"/>
+        <w:keepNext w:val="0"/>
+        <w:widowControl/>
+        <w:spacing w:before="40" w:after="0" w:line="255" w:lineRule="exact"/>
+      </w:pPr>
+      <w:r>
+        <w:rPr>
+          <w:rFonts w:ascii="JetBrains Mono" w:hAnsi="JetBrains Mono" w:eastAsia="JetBrains Mono" w:cs="JetBrains Mono"/>
+          <w:b w:val="0"/>
+          <w:i w:val="0"/>
+          <w:color w:val="1F1C18"/>
+          <w:sz w:val="16"/>
+          <w:u w:val="none"/>
+          <w:lang w:val="en-US"/>
+        </w:rPr>
+        <w:t>- Facilitated a monthly engineering reading group on reliability and testing; captured short notes linking each discussion to a concrete improvement in the team's development process.</w:t>
+      </w:r>
+    </w:p>
+    <w:p>
+      <w:pPr>
+        <w:pStyle w:val="ResumeBody"/>
+        <w:keepNext w:val="0"/>
+        <w:widowControl/>
+        <w:spacing w:before="40" w:after="0" w:line="255" w:lineRule="exact"/>
+      </w:pPr>
+      <w:r>
+        <w:rPr>
+          <w:rFonts w:ascii="JetBrains Mono" w:hAnsi="JetBrains Mono" w:eastAsia="JetBrains Mono" w:cs="JetBrains Mono"/>
+          <w:b w:val="0"/>
+          <w:i w:val="0"/>
+          <w:color w:val="1F1C18"/>
+          <w:sz w:val="16"/>
+          <w:u w:val="none"/>
+          <w:lang w:val="en-US"/>
+        </w:rPr>
+        <w:t>- Volunteered at a fictional community coding club, supporting beginner projects and reviewing examples for clear naming, useful errors and straightforward setup instructions.</w:t>
       </w:r>
     </w:p>
     <w:sectPr>

</xml_diff>

<commit_message>
Edit repository prose for direct wording and concrete descriptions
</commit_message>
<xml_diff>
--- a/output/avery-quill-quant.docx
+++ b/output/avery-quill-quant.docx
@@ -81,7 +81,7 @@
           <w:u w:val="none"/>
           <w:lang w:val="en-US"/>
         </w:rPr>
-        <w:t>Fictional example; all career details and results are invented. Software engineer building dependable tools for creative teams, from early prototypes to services used in daily production. Combines backend development, data modelling and close user collaboration with practical experience in search, asynchronous processing and operational support. Enjoys making complex workflows easier to understand, test and maintain.</w:t>
+        <w:t>Fictional example; all career details and results are invented. Software engineer working on asset catalogues, review services and reporting tools for creative teams. Builds Python and TypeScript services with PostgreSQL, background workers and automated tests. Works with designers and support teams to define requirements, investigate production failures and maintain integrations through schema changes and releases. Measures search relevance against a fixed query set, profiles database performance and tests worker recovery with controlled failures before releasing changes to production.</w:t>
       </w:r>
     </w:p>
     <w:p>
@@ -350,7 +350,7 @@
           <w:u w:val="none"/>
           <w:lang w:val="en-US"/>
         </w:rPr>
-        <w:t>Zero-to-one delivery</w:t>
+        <w:t>Built</w:t>
       </w:r>
       <w:r>
         <w:rPr>
@@ -362,7 +362,7 @@
           <w:u w:val="none"/>
           <w:lang w:val="en-US"/>
         </w:rPr>
-        <w:t xml:space="preserve"> - built a review service for design teams, bringing </w:t>
+        <w:t xml:space="preserve"> a review service for design teams, bringing </w:t>
       </w:r>
       <w:r>
         <w:rPr>
@@ -778,7 +778,7 @@
           <w:u w:val="none"/>
           <w:lang w:val="en-US"/>
         </w:rPr>
-        <w:t>- Created a representative set of 180 search queries with support colleagues and tracked regressions before releases, making relevance decisions easier to explain and reproduce.</w:t>
+        <w:t>- Created a representative set of 180 search queries with support colleagues and tracked regressions before releases, documenting how each ranking change affected the results.</w:t>
       </w:r>
     </w:p>
     <w:p>
@@ -799,7 +799,7 @@
           <w:u w:val="none"/>
           <w:lang w:val="en-US"/>
         </w:rPr>
-        <w:t>- Rotated through production support, documented recurring failure patterns and turned the most common fixes into automated checks and clearer customer-facing error messages.</w:t>
+        <w:t>- Rotated through production support, documented recurring failure patterns and added automated checks for common failures and error messages with recovery steps.</w:t>
       </w:r>
     </w:p>
     <w:p>
@@ -1143,7 +1143,7 @@
           <w:u w:val="none"/>
           <w:lang w:val="en-US"/>
         </w:rPr>
-        <w:t>- Prototyped a catalogue for a fictional community film archive, combining structured metadata filters with text search. Interviewed volunteer librarians, defined a small relevance benchmark and compared ranking changes against the same query set.</w:t>
+        <w:t>- Prototyped a catalogue for a community film archive, combining structured metadata filters with text search. Interviewed volunteer librarians, defined a small relevance benchmark and compared ranking changes against the same query set.</w:t>
       </w:r>
     </w:p>
     <w:p>
@@ -1415,7 +1415,7 @@
           <w:u w:val="none"/>
           <w:lang w:val="en-US"/>
         </w:rPr>
-        <w:t>- Wrote a practical guide to diagnosing background-job failures, using worked examples to explain timeouts, retries and duplicate processing to engineers joining the team.</w:t>
+        <w:t>- Wrote a guide to diagnosing background-job failures, using worked examples to explain timeouts, retries and duplicate processing to engineers joining the team.</w:t>
       </w:r>
     </w:p>
     <w:p>
@@ -1455,7 +1455,7 @@
           <w:u w:val="none"/>
           <w:lang w:val="en-US"/>
         </w:rPr>
-        <w:t>- Volunteered at a fictional community coding club, supporting beginner projects and reviewing examples for clear naming, useful errors and straightforward setup instructions.</w:t>
+        <w:t>- Volunteered at a community coding club, helping beginners debug projects, write error messages and document installation steps.</w:t>
       </w:r>
     </w:p>
     <w:sectPr>

</xml_diff>